<commit_message>
feat(word-diff): support sequential body flow with embedded native table grids and vector shape rendering
</commit_message>
<xml_diff>
--- a/macos/Assets/工作日报.docx
+++ b/macos/Assets/工作日报.docx
@@ -2,22 +2,309 @@
 <file path=word/document.xml><?xml version="1.0" encoding="utf-8"?>
 <w:document xmlns:wpc="http://schemas.microsoft.com/office/word/2010/wordprocessingCanvas" xmlns:cx="http://schemas.microsoft.com/office/drawing/2014/chartex" xmlns:cx1="http://schemas.microsoft.com/office/drawing/2015/9/8/chartex" xmlns:cx2="http://schemas.microsoft.com/office/drawing/2015/10/21/chartex" xmlns:cx3="http://schemas.microsoft.com/office/drawing/2016/5/9/chartex" xmlns:cx4="http://schemas.microsoft.com/office/drawing/2016/5/10/chartex" xmlns:cx5="http://schemas.microsoft.com/office/drawing/2016/5/11/chartex" xmlns:cx6="http://schemas.microsoft.com/office/drawing/2016/5/12/chartex" xmlns:cx7="http://schemas.microsoft.com/office/drawing/2016/5/13/chartex" xmlns:cx8="http://schemas.microsoft.com/office/drawing/2016/5/14/chartex" xmlns:mc="http://schemas.openxmlformats.org/markup-compatibility/2006" xmlns:o="urn:schemas-microsoft-com:office:office" xmlns:r="http://schemas.openxmlformats.org/officeDocument/2006/relationships" xmlns:m="http://schemas.openxmlformats.org/officeDocument/2006/math" xmlns:v="urn:schemas-microsoft-com:vml" xmlns:wp14="http://schemas.microsoft.com/office/word/2010/wordprocessingDrawing" xmlns:wp="http://schemas.openxmlformats.org/drawingml/2006/wordprocessingDrawing" xmlns:w="http://schemas.openxmlformats.org/wordprocessingml/2006/main" xmlns:w14="http://schemas.microsoft.com/office/word/2010/wordml" xmlns:w10="urn:schemas-microsoft-com:office:word" xmlns:w15="http://schemas.microsoft.com/office/word/2012/wordml" xmlns:wpg="http://schemas.microsoft.com/office/word/2010/wordprocessingGroup" xmlns:wpi="http://schemas.microsoft.com/office/word/2010/wordprocessingInk" xmlns:wne="http://schemas.microsoft.com/office/word/2006/wordml" xmlns:wps="http://schemas.microsoft.com/office/word/2010/wordprocessingShape" xmlns:wpsCustomData="http://www.wps.cn/officeDocument/2013/wpsCustomData" mc:Ignorable="w14 w15 wp14">
   <w:body>
+    <w:tbl>
+      <w:tblPr>
+        <w:tblStyle w:val="15"/>
+        <w:tblW w:w="0" w:type="auto"/>
+        <w:tblInd w:w="0" w:type="dxa"/>
+        <w:tblBorders>
+          <w:top w:val="single" w:color="auto" w:sz="4" w:space="0"/>
+          <w:left w:val="single" w:color="auto" w:sz="4" w:space="0"/>
+          <w:bottom w:val="single" w:color="auto" w:sz="4" w:space="0"/>
+          <w:right w:val="single" w:color="auto" w:sz="4" w:space="0"/>
+          <w:insideH w:val="single" w:color="auto" w:sz="4" w:space="0"/>
+          <w:insideV w:val="single" w:color="auto" w:sz="4" w:space="0"/>
+        </w:tblBorders>
+        <w:tblLayout w:type="autofit"/>
+        <w:tblCellMar>
+          <w:left w:w="108" w:type="dxa"/>
+          <w:right w:w="108" w:type="dxa"/>
+        </w:tblCellMar>
+      </w:tblPr>
+      <w:tblGrid>
+        <w:gridCol w:w="2130"/>
+        <w:gridCol w:w="2130"/>
+        <w:gridCol w:w="2131"/>
+        <w:gridCol w:w="2131"/>
+      </w:tblGrid>
+      <w:tr>
+        <w:tc>
+          <w:tcPr>
+            <w:tcW w:w="2130" w:type="dxa"/>
+          </w:tcPr>
+          <w:p>
+            <w:pPr>
+              <w:pStyle w:val="2"/>
+              <w:bidi w:val="0"/>
+              <w:spacing w:before="0" w:beforeLines="0" w:after="0" w:afterLines="0"/>
+              <w:rPr>
+                <w:rFonts w:hint="eastAsia" w:ascii="SimHei" w:hAnsi="SimHei" w:eastAsia="SimHei" w:cs="SimHei"/>
+                <w:i w:val="0"/>
+                <w:caps w:val="0"/>
+                <w:color w:val="1F2329"/>
+                <w:spacing w:val="0"/>
+                <w:shd w:val="clear" w:fill="FFFFFF"/>
+                <w:vertAlign w:val="baseline"/>
+                <w:lang w:val="en-US" w:eastAsia="zh-CN"/>
+              </w:rPr>
+            </w:pPr>
+            <w:r>
+              <w:rPr>
+                <w:rFonts w:hint="eastAsia" w:ascii="SimHei" w:hAnsi="SimHei" w:eastAsia="SimHei" w:cs="SimHei"/>
+                <w:i w:val="0"/>
+                <w:caps w:val="0"/>
+                <w:color w:val="1F2329"/>
+                <w:spacing w:val="0"/>
+                <w:shd w:val="clear" w:fill="FFFFFF"/>
+                <w:vertAlign w:val="baseline"/>
+                <w:lang w:val="en-US" w:eastAsia="zh-CN"/>
+              </w:rPr>
+              <w:t>得到的</w:t>
+            </w:r>
+          </w:p>
+        </w:tc>
+        <w:tc>
+          <w:tcPr>
+            <w:tcW w:w="2130" w:type="dxa"/>
+          </w:tcPr>
+          <w:p>
+            <w:pPr>
+              <w:pStyle w:val="2"/>
+              <w:bidi w:val="0"/>
+              <w:spacing w:before="0" w:beforeLines="0" w:after="0" w:afterLines="0"/>
+              <w:rPr>
+                <w:rFonts w:hint="eastAsia" w:ascii="SimHei" w:hAnsi="SimHei" w:eastAsia="SimHei" w:cs="SimHei"/>
+                <w:i w:val="0"/>
+                <w:caps w:val="0"/>
+                <w:color w:val="1F2329"/>
+                <w:spacing w:val="0"/>
+                <w:shd w:val="clear" w:fill="FFFFFF"/>
+                <w:vertAlign w:val="baseline"/>
+              </w:rPr>
+            </w:pPr>
+          </w:p>
+        </w:tc>
+        <w:tc>
+          <w:tcPr>
+            <w:tcW w:w="2131" w:type="dxa"/>
+          </w:tcPr>
+          <w:p>
+            <w:pPr>
+              <w:pStyle w:val="2"/>
+              <w:bidi w:val="0"/>
+              <w:spacing w:before="0" w:beforeLines="0" w:after="0" w:afterLines="0"/>
+              <w:rPr>
+                <w:rFonts w:hint="eastAsia" w:ascii="SimHei" w:hAnsi="SimHei" w:eastAsia="SimHei" w:cs="SimHei"/>
+                <w:i w:val="0"/>
+                <w:caps w:val="0"/>
+                <w:color w:val="1F2329"/>
+                <w:spacing w:val="0"/>
+                <w:shd w:val="clear" w:fill="FFFFFF"/>
+                <w:vertAlign w:val="baseline"/>
+              </w:rPr>
+            </w:pPr>
+          </w:p>
+        </w:tc>
+        <w:tc>
+          <w:tcPr>
+            <w:tcW w:w="2131" w:type="dxa"/>
+          </w:tcPr>
+          <w:p>
+            <w:pPr>
+              <w:pStyle w:val="2"/>
+              <w:bidi w:val="0"/>
+              <w:spacing w:before="0" w:beforeLines="0" w:after="0" w:afterLines="0"/>
+              <w:rPr>
+                <w:rFonts w:hint="eastAsia" w:ascii="SimHei" w:hAnsi="SimHei" w:eastAsia="SimHei" w:cs="SimHei"/>
+                <w:i w:val="0"/>
+                <w:caps w:val="0"/>
+                <w:color w:val="1F2329"/>
+                <w:spacing w:val="0"/>
+                <w:shd w:val="clear" w:fill="FFFFFF"/>
+                <w:vertAlign w:val="baseline"/>
+              </w:rPr>
+            </w:pPr>
+          </w:p>
+        </w:tc>
+      </w:tr>
+      <w:tr>
+        <w:tc>
+          <w:tcPr>
+            <w:tcW w:w="2130" w:type="dxa"/>
+          </w:tcPr>
+          <w:p>
+            <w:pPr>
+              <w:pStyle w:val="2"/>
+              <w:bidi w:val="0"/>
+              <w:spacing w:before="0" w:beforeLines="0" w:after="0" w:afterLines="0"/>
+              <w:rPr>
+                <w:rFonts w:hint="eastAsia" w:ascii="SimHei" w:hAnsi="SimHei" w:eastAsia="SimHei" w:cs="SimHei"/>
+                <w:i w:val="0"/>
+                <w:caps w:val="0"/>
+                <w:color w:val="1F2329"/>
+                <w:spacing w:val="0"/>
+                <w:shd w:val="clear" w:fill="FFFFFF"/>
+                <w:vertAlign w:val="baseline"/>
+              </w:rPr>
+            </w:pPr>
+          </w:p>
+        </w:tc>
+        <w:tc>
+          <w:tcPr>
+            <w:tcW w:w="2130" w:type="dxa"/>
+          </w:tcPr>
+          <w:p>
+            <w:pPr>
+              <w:pStyle w:val="2"/>
+              <w:bidi w:val="0"/>
+              <w:spacing w:before="0" w:beforeLines="0" w:after="0" w:afterLines="0"/>
+              <w:rPr>
+                <w:rFonts w:hint="eastAsia" w:ascii="SimHei" w:hAnsi="SimHei" w:eastAsia="SimHei" w:cs="SimHei"/>
+                <w:i w:val="0"/>
+                <w:caps w:val="0"/>
+                <w:color w:val="1F2329"/>
+                <w:spacing w:val="0"/>
+                <w:shd w:val="clear" w:fill="FFFFFF"/>
+                <w:vertAlign w:val="baseline"/>
+              </w:rPr>
+            </w:pPr>
+          </w:p>
+        </w:tc>
+        <w:tc>
+          <w:tcPr>
+            <w:tcW w:w="2131" w:type="dxa"/>
+          </w:tcPr>
+          <w:p>
+            <w:pPr>
+              <w:pStyle w:val="2"/>
+              <w:bidi w:val="0"/>
+              <w:spacing w:before="0" w:beforeLines="0" w:after="0" w:afterLines="0"/>
+              <w:rPr>
+                <w:rFonts w:hint="eastAsia" w:ascii="SimHei" w:hAnsi="SimHei" w:eastAsia="SimHei" w:cs="SimHei"/>
+                <w:i w:val="0"/>
+                <w:caps w:val="0"/>
+                <w:color w:val="1F2329"/>
+                <w:spacing w:val="0"/>
+                <w:shd w:val="clear" w:fill="FFFFFF"/>
+                <w:vertAlign w:val="baseline"/>
+              </w:rPr>
+            </w:pPr>
+          </w:p>
+        </w:tc>
+        <w:tc>
+          <w:tcPr>
+            <w:tcW w:w="2131" w:type="dxa"/>
+          </w:tcPr>
+          <w:p>
+            <w:pPr>
+              <w:pStyle w:val="2"/>
+              <w:bidi w:val="0"/>
+              <w:spacing w:before="0" w:beforeLines="0" w:after="0" w:afterLines="0"/>
+              <w:rPr>
+                <w:rFonts w:hint="eastAsia" w:ascii="SimHei" w:hAnsi="SimHei" w:eastAsia="SimHei" w:cs="SimHei"/>
+                <w:i w:val="0"/>
+                <w:caps w:val="0"/>
+                <w:color w:val="1F2329"/>
+                <w:spacing w:val="0"/>
+                <w:shd w:val="clear" w:fill="FFFFFF"/>
+                <w:vertAlign w:val="baseline"/>
+              </w:rPr>
+            </w:pPr>
+          </w:p>
+        </w:tc>
+      </w:tr>
+      <w:tr>
+        <w:tc>
+          <w:tcPr>
+            <w:tcW w:w="2130" w:type="dxa"/>
+          </w:tcPr>
+          <w:p>
+            <w:pPr>
+              <w:pStyle w:val="2"/>
+              <w:bidi w:val="0"/>
+              <w:spacing w:before="0" w:beforeLines="0" w:after="0" w:afterLines="0"/>
+              <w:rPr>
+                <w:rFonts w:hint="eastAsia" w:ascii="SimHei" w:hAnsi="SimHei" w:eastAsia="SimHei" w:cs="SimHei"/>
+                <w:i w:val="0"/>
+                <w:caps w:val="0"/>
+                <w:color w:val="1F2329"/>
+                <w:spacing w:val="0"/>
+                <w:shd w:val="clear" w:fill="FFFFFF"/>
+                <w:vertAlign w:val="baseline"/>
+              </w:rPr>
+            </w:pPr>
+          </w:p>
+        </w:tc>
+        <w:tc>
+          <w:tcPr>
+            <w:tcW w:w="2130" w:type="dxa"/>
+          </w:tcPr>
+          <w:p>
+            <w:pPr>
+              <w:pStyle w:val="2"/>
+              <w:bidi w:val="0"/>
+              <w:spacing w:before="0" w:beforeLines="0" w:after="0" w:afterLines="0"/>
+              <w:rPr>
+                <w:rFonts w:hint="eastAsia" w:ascii="SimHei" w:hAnsi="SimHei" w:eastAsia="SimHei" w:cs="SimHei"/>
+                <w:i w:val="0"/>
+                <w:caps w:val="0"/>
+                <w:color w:val="1F2329"/>
+                <w:spacing w:val="0"/>
+                <w:shd w:val="clear" w:fill="FFFFFF"/>
+                <w:vertAlign w:val="baseline"/>
+              </w:rPr>
+            </w:pPr>
+          </w:p>
+        </w:tc>
+        <w:tc>
+          <w:tcPr>
+            <w:tcW w:w="2131" w:type="dxa"/>
+          </w:tcPr>
+          <w:p>
+            <w:pPr>
+              <w:pStyle w:val="2"/>
+              <w:bidi w:val="0"/>
+              <w:spacing w:before="0" w:beforeLines="0" w:after="0" w:afterLines="0"/>
+              <w:rPr>
+                <w:rFonts w:hint="eastAsia" w:ascii="SimHei" w:hAnsi="SimHei" w:eastAsia="SimHei" w:cs="SimHei"/>
+                <w:i w:val="0"/>
+                <w:caps w:val="0"/>
+                <w:color w:val="1F2329"/>
+                <w:spacing w:val="0"/>
+                <w:shd w:val="clear" w:fill="FFFFFF"/>
+                <w:vertAlign w:val="baseline"/>
+              </w:rPr>
+            </w:pPr>
+          </w:p>
+        </w:tc>
+        <w:tc>
+          <w:tcPr>
+            <w:tcW w:w="2131" w:type="dxa"/>
+          </w:tcPr>
+          <w:p>
+            <w:pPr>
+              <w:pStyle w:val="2"/>
+              <w:bidi w:val="0"/>
+              <w:spacing w:before="0" w:beforeLines="0" w:after="0" w:afterLines="0"/>
+              <w:rPr>
+                <w:rFonts w:hint="eastAsia" w:ascii="SimHei" w:hAnsi="SimHei" w:eastAsia="SimHei" w:cs="SimHei"/>
+                <w:i w:val="0"/>
+                <w:caps w:val="0"/>
+                <w:color w:val="1F2329"/>
+                <w:spacing w:val="0"/>
+                <w:shd w:val="clear" w:fill="FFFFFF"/>
+                <w:vertAlign w:val="baseline"/>
+              </w:rPr>
+            </w:pPr>
+          </w:p>
+        </w:tc>
+      </w:tr>
+    </w:tbl>
     <w:p>
       <w:pPr>
         <w:pStyle w:val="2"/>
         <w:bidi w:val="0"/>
         <w:spacing w:before="0" w:beforeLines="0" w:after="0" w:afterLines="0"/>
-        <w:rPr>
-          <w:rFonts w:hint="eastAsia" w:ascii="Arial" w:hAnsi="Arial" w:eastAsia="SimHei" w:cs="Arial"/>
-          <w:i w:val="0"/>
-          <w:caps w:val="0"/>
-          <w:color w:val="1F2329"/>
-          <w:spacing w:val="0"/>
-          <w:shd w:val="clear" w:fill="FFFFFF"/>
-          <w:lang w:val="en-US" w:eastAsia="zh-CN"/>
-        </w:rPr>
-      </w:pPr>
-      <w:r>
         <w:rPr>
           <w:rFonts w:hint="eastAsia" w:ascii="SimHei" w:hAnsi="SimHei" w:eastAsia="SimHei" w:cs="SimHei"/>
           <w:i w:val="0"/>
@@ -26,10 +313,76 @@
           <w:spacing w:val="0"/>
           <w:shd w:val="clear" w:fill="FFFFFF"/>
         </w:rPr>
+      </w:pPr>
+      <w:r>
+        <w:rPr>
+          <w:rFonts w:hint="eastAsia" w:ascii="SimHei" w:hAnsi="SimHei" w:eastAsia="SimHei" w:cs="SimHei"/>
+          <w:i w:val="0"/>
+          <w:caps w:val="0"/>
+          <w:color w:val="1F2329"/>
+          <w:spacing w:val="0"/>
+          <w:shd w:val="clear" w:fill="FFFFFF"/>
+        </w:rPr>
         <w:t>工作日报</w:t>
       </w:r>
-      <w:bookmarkStart w:id="0" w:name="_GoBack"/>
-      <w:bookmarkEnd w:id="0"/>
+    </w:p>
+    <w:p>
+      <w:pPr>
+        <w:rPr>
+          <w:rFonts w:hint="eastAsia" w:eastAsia="SimHei"/>
+          <w:lang w:val="en-US" w:eastAsia="zh-CN"/>
+        </w:rPr>
+      </w:pPr>
+      <w:r>
+        <w:rPr>
+          <w:rFonts w:hint="eastAsia" w:eastAsia="SimHei"/>
+          <w:lang w:val="en-US" w:eastAsia="zh-CN"/>
+        </w:rPr>
+        <w:drawing>
+          <wp:inline distT="0" distB="0" distL="114300" distR="114300">
+            <wp:extent cx="5267960" cy="3510915"/>
+            <wp:effectExtent l="0" t="0" r="15240" b="19685"/>
+            <wp:docPr id="1" name="図形 1" descr="做比昨天更好的自己。木制办公桌上的文字相框"/>
+            <wp:cNvGraphicFramePr>
+              <a:graphicFrameLocks xmlns:a="http://schemas.openxmlformats.org/drawingml/2006/main" noChangeAspect="1"/>
+              <a:extLst xmlns:a="http://schemas.openxmlformats.org/drawingml/2006/main">
+                <a:ext uri="{7FBC4E63-A832-4D11-8238-D91031DB1400}">
+                  <s:tag xmlns="http://www.wps.cn/officeDocument/2013/wpsCustomData" xmlns:s="http://www.wps.cn/officeDocument/2013/wpsCustomData">
+                    <s:item s:name="KSO_DOCER_RESOURCE_TRACE_INFO" s:val="{&quot;id&quot;:&quot;212149587&quot;,&quot;origin&quot;:0,&quot;type&quot;:&quot;pictures&quot;,&quot;user&quot;:&quot;1799084796&quot;}"/>
+                  </s:tag>
+                </a:ext>
+              </a:extLst>
+            </wp:cNvGraphicFramePr>
+            <a:graphic xmlns:a="http://schemas.openxmlformats.org/drawingml/2006/main">
+              <a:graphicData uri="http://schemas.openxmlformats.org/drawingml/2006/picture">
+                <pic:pic xmlns:pic="http://schemas.openxmlformats.org/drawingml/2006/picture">
+                  <pic:nvPicPr>
+                    <pic:cNvPr id="1" name="図形 1" descr="做比昨天更好的自己。木制办公桌上的文字相框"/>
+                    <pic:cNvPicPr>
+                      <a:picLocks noChangeAspect="1"/>
+                    </pic:cNvPicPr>
+                  </pic:nvPicPr>
+                  <pic:blipFill>
+                    <a:blip r:embed="rId6"/>
+                    <a:stretch>
+                      <a:fillRect/>
+                    </a:stretch>
+                  </pic:blipFill>
+                  <pic:spPr>
+                    <a:xfrm>
+                      <a:off x="0" y="0"/>
+                      <a:ext cx="5267960" cy="3510915"/>
+                    </a:xfrm>
+                    <a:prstGeom prst="rect">
+                      <a:avLst/>
+                    </a:prstGeom>
+                  </pic:spPr>
+                </pic:pic>
+              </a:graphicData>
+            </a:graphic>
+          </wp:inline>
+        </w:drawing>
+      </w:r>
     </w:p>
     <w:p>
       <w:pPr>
@@ -69,6 +422,101 @@
         </w:rPr>
         <w:t>要获得事业的成功，必须奋斗，而不是乞求。〔英国〕菲·马辛杰</w:t>
       </w:r>
+    </w:p>
+    <w:p>
+      <w:pPr>
+        <w:numPr>
+          <w:ilvl w:val="0"/>
+          <w:numId w:val="0"/>
+        </w:numPr>
+        <w:ind w:leftChars="0"/>
+        <w:jc w:val="left"/>
+        <w:rPr>
+          <w:rFonts w:hint="eastAsia" w:ascii="Microsoft YaHei" w:hAnsi="Microsoft YaHei" w:eastAsia="Microsoft YaHei" w:cs="Microsoft YaHei"/>
+          <w:b w:val="0"/>
+          <w:bCs w:val="0"/>
+          <w:i w:val="0"/>
+          <w:caps w:val="0"/>
+          <w:color w:val="1F2329"/>
+          <w:spacing w:val="0"/>
+          <w:sz w:val="24"/>
+          <w:szCs w:val="24"/>
+          <w:shd w:val="clear" w:fill="FFFFFF"/>
+          <w:lang w:eastAsia="zh-CN"/>
+        </w:rPr>
+      </w:pPr>
+      <w:bookmarkStart w:id="0" w:name="_GoBack"/>
+      <w:r>
+        <w:rPr>
+          <w:sz w:val="24"/>
+        </w:rPr>
+        <mc:AlternateContent>
+          <mc:Choice Requires="wps">
+            <w:drawing>
+              <wp:anchor distT="0" distB="0" distL="114300" distR="114300" simplePos="0" relativeHeight="251659264" behindDoc="0" locked="0" layoutInCell="1" allowOverlap="1">
+                <wp:simplePos x="0" y="0"/>
+                <wp:positionH relativeFrom="column">
+                  <wp:posOffset>220980</wp:posOffset>
+                </wp:positionH>
+                <wp:positionV relativeFrom="paragraph">
+                  <wp:posOffset>173355</wp:posOffset>
+                </wp:positionV>
+                <wp:extent cx="776605" cy="271780"/>
+                <wp:effectExtent l="6350" t="6350" r="29845" b="26670"/>
+                <wp:wrapNone/>
+                <wp:docPr id="2" name="四角形 2"/>
+                <wp:cNvGraphicFramePr/>
+                <a:graphic xmlns:a="http://schemas.openxmlformats.org/drawingml/2006/main">
+                  <a:graphicData uri="http://schemas.microsoft.com/office/word/2010/wordprocessingShape">
+                    <wps:wsp>
+                      <wps:cNvSpPr/>
+                      <wps:spPr>
+                        <a:xfrm>
+                          <a:off x="1363980" y="7256780"/>
+                          <a:ext cx="776605" cy="271780"/>
+                        </a:xfrm>
+                        <a:prstGeom prst="rect">
+                          <a:avLst/>
+                        </a:prstGeom>
+                      </wps:spPr>
+                      <wps:style>
+                        <a:lnRef idx="2">
+                          <a:schemeClr val="accent1">
+                            <a:lumMod val="75000"/>
+                          </a:schemeClr>
+                        </a:lnRef>
+                        <a:fillRef idx="1">
+                          <a:schemeClr val="accent1"/>
+                        </a:fillRef>
+                        <a:effectRef idx="0">
+                          <a:srgbClr val="FFFFFF"/>
+                        </a:effectRef>
+                        <a:fontRef idx="minor">
+                          <a:schemeClr val="lt1"/>
+                        </a:fontRef>
+                      </wps:style>
+                      <wps:bodyPr rot="0" spcFirstLastPara="0" vertOverflow="overflow" horzOverflow="overflow" vert="horz" wrap="square" lIns="91440" tIns="45720" rIns="91440" bIns="45720" numCol="1" spcCol="0" rtlCol="0" fromWordArt="0" anchor="ctr" anchorCtr="0" forceAA="0" compatLnSpc="1">
+                        <a:noAutofit/>
+                      </wps:bodyPr>
+                    </wps:wsp>
+                  </a:graphicData>
+                </a:graphic>
+              </wp:anchor>
+            </w:drawing>
+          </mc:Choice>
+          <mc:Fallback>
+            <w:pict>
+              <v:rect id="_x0000_s1026" o:spid="_x0000_s1026" o:spt="1" style="position:absolute;left:0pt;margin-left:17.4pt;margin-top:13.65pt;height:21.4pt;width:61.15pt;z-index:251659264;v-text-anchor:middle;mso-width-relative:page;mso-height-relative:page;" fillcolor="#5B9BD5 [3204]" filled="t" stroked="t" coordsize="21600,21600" o:gfxdata="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">
+                <v:fill on="t" focussize="0,0"/>
+                <v:stroke weight="1pt" color="#2E75B6 [2404]" miterlimit="8" joinstyle="miter"/>
+                <v:imagedata o:title=""/>
+                <o:lock v:ext="edit" aspectratio="f"/>
+              </v:rect>
+            </w:pict>
+          </mc:Fallback>
+        </mc:AlternateContent>
+      </w:r>
+      <w:bookmarkEnd w:id="0"/>
     </w:p>
     <w:p>
       <w:pPr>
@@ -1817,4 +2265,21 @@
   </a:themeElements>
   <a:objectDefaults/>
 </a:theme>
+</file>
+
+<file path=customXml/item1.xml><?xml version="1.0" encoding="utf-8"?>
+<s:customData xmlns="http://www.wps.cn/officeDocument/2013/wpsCustomData" xmlns:s="http://www.wps.cn/officeDocument/2013/wpsCustomData">
+  <customSectProps/>
+  <customShpExts>
+    <customShpInfo spid="_x0000_s1026" textRotate="1"/>
+  </customShpExts>
+</s:customData>
+</file>
+
+<file path=customXml/itemProps1.xml><?xml version="1.0" encoding="utf-8"?>
+<ds:datastoreItem xmlns:ds="http://schemas.openxmlformats.org/officeDocument/2006/customXml" ds:itemID="{B1977F7D-205B-4081-913C-38D41E755F92}">
+  <ds:schemaRefs>
+    <ds:schemaRef ds:uri="http://www.wps.cn/officeDocument/2013/wpsCustomData"/>
+  </ds:schemaRefs>
+</ds:datastoreItem>
 </file>
</xml_diff>